<commit_message>
Add confirmed team and faculty details to the verified final report
</commit_message>
<xml_diff>
--- a/report/Bengaluru_AirWatch_Final_Report.docx
+++ b/report/Bengaluru_AirWatch_Final_Report.docx
@@ -33,6 +33,134 @@
         <w:t>Historical observations from six Bengaluru monitoring stations</w:t>
         <w:br/>
         <w:t>Study window 1 January 2024 to 31 December 2025 in IST</w:t>
+      </w:r>
+    </w:p>
+    <w:tbl>
+      <w:tblPr>
+        <w:tblStyle w:val="LightShading-Accent1"/>
+        <w:tblW w:type="auto" w:w="0"/>
+        <w:tblLook w:firstColumn="1" w:firstRow="1" w:lastColumn="0" w:lastRow="0" w:noHBand="0" w:noVBand="1" w:val="04A0"/>
+      </w:tblPr>
+      <w:tblGrid>
+        <w:gridCol w:w="4831"/>
+        <w:gridCol w:w="4831"/>
+      </w:tblGrid>
+      <w:tr>
+        <w:trPr>
+          <w:tblHeader/>
+          <w:cantSplit/>
+        </w:trPr>
+        <w:tc>
+          <w:tcPr>
+            <w:tcW w:type="dxa" w:w="4831"/>
+          </w:tcPr>
+          <w:p>
+            <w:pPr>
+              <w:spacing w:after="60"/>
+            </w:pPr>
+            <w:r>
+              <w:rPr>
+                <w:sz w:val="18"/>
+              </w:rPr>
+              <w:t>Student name</w:t>
+            </w:r>
+          </w:p>
+        </w:tc>
+        <w:tc>
+          <w:tcPr>
+            <w:tcW w:type="dxa" w:w="4831"/>
+          </w:tcPr>
+          <w:p>
+            <w:pPr>
+              <w:spacing w:after="60"/>
+            </w:pPr>
+            <w:r>
+              <w:rPr>
+                <w:sz w:val="18"/>
+              </w:rPr>
+              <w:t>USN</w:t>
+            </w:r>
+          </w:p>
+        </w:tc>
+      </w:tr>
+      <w:tr>
+        <w:trPr>
+          <w:cantSplit/>
+        </w:trPr>
+        <w:tc>
+          <w:tcPr>
+            <w:tcW w:type="dxa" w:w="4831"/>
+          </w:tcPr>
+          <w:p>
+            <w:pPr>
+              <w:spacing w:after="60"/>
+            </w:pPr>
+            <w:r>
+              <w:rPr>
+                <w:sz w:val="18"/>
+              </w:rPr>
+              <w:t>Anusha Agarwal</w:t>
+            </w:r>
+          </w:p>
+        </w:tc>
+        <w:tc>
+          <w:tcPr>
+            <w:tcW w:type="dxa" w:w="4831"/>
+          </w:tcPr>
+          <w:p>
+            <w:pPr>
+              <w:spacing w:after="60"/>
+            </w:pPr>
+            <w:r>
+              <w:rPr>
+                <w:sz w:val="18"/>
+              </w:rPr>
+              <w:t>1MS24CS034</w:t>
+            </w:r>
+          </w:p>
+        </w:tc>
+      </w:tr>
+      <w:tr>
+        <w:trPr>
+          <w:cantSplit/>
+        </w:trPr>
+        <w:tc>
+          <w:tcPr>
+            <w:tcW w:type="dxa" w:w="4831"/>
+          </w:tcPr>
+          <w:p>
+            <w:pPr>
+              <w:spacing w:after="60"/>
+            </w:pPr>
+            <w:r>
+              <w:rPr>
+                <w:sz w:val="18"/>
+              </w:rPr>
+              <w:t>Jeevika N</w:t>
+            </w:r>
+          </w:p>
+        </w:tc>
+        <w:tc>
+          <w:tcPr>
+            <w:tcW w:type="dxa" w:w="4831"/>
+          </w:tcPr>
+          <w:p>
+            <w:pPr>
+              <w:spacing w:after="60"/>
+            </w:pPr>
+            <w:r>
+              <w:rPr>
+                <w:sz w:val="18"/>
+              </w:rPr>
+              <w:t>1MS24CS071</w:t>
+            </w:r>
+          </w:p>
+        </w:tc>
+      </w:tr>
+    </w:tbl>
+    <w:p>
+      <w:r>
+        <w:t>Faculty guide: Uzma Sulthana</w:t>
       </w:r>
     </w:p>
     <w:p>

</xml_diff>